<commit_message>
Update project files and assets
</commit_message>
<xml_diff>
--- a/A11.2024.15693-Tugas-CRUD.docx
+++ b/A11.2024.15693-Tugas-CRUD.docx
@@ -828,10 +828,7 @@
     </w:p>
     <w:p>
       <w:r>
-        <w:t>Mengusung tema Dark Mode / Light Mode dengan palet warna teal (#0D9488) sebagai warna primer dan amber (#F59E0B) sebagai aksen. Menggunakan dua tipografi: Poppins untuk judul/heading dan Inter untuk body teks. Seluruh ikon menggunakan Phosphor Icons untuk tampilan yang konsisten dan profesional</w:t>
-      </w:r>
-      <w:r>
-        <w:t>.</w:t>
+        <w:t>Mengusung tema Dark Mode / Light Mode dengan palet warna teal (#0D9488) sebagai warna primer dan amber (#F59E0B) sebagai aksen. Menggunakan dua tipografi: Poppins untuk judul/heading dan Inter untuk body teks. Seluruh ikon menggunakan Phosphor Icons untuk tampilan yang konsisten dan profesional.</w:t>
       </w:r>
     </w:p>
     <w:p/>
@@ -900,7 +897,7 @@
           <w:noProof/>
         </w:rPr>
         <w:drawing>
-          <wp:inline distT="0" distB="0" distL="0" distR="0" wp14:anchorId="28E52825" wp14:editId="74679201">
+          <wp:inline distT="0" distB="0" distL="0" distR="0" wp14:anchorId="28E52825" wp14:editId="0CD6841D">
             <wp:extent cx="5943600" cy="3061335"/>
             <wp:effectExtent l="0" t="0" r="0" b="5715"/>
             <wp:docPr id="362939311" name="Picture 14"/>
@@ -1183,10 +1180,51 @@
     <w:p/>
     <w:p>
       <w:r>
+        <w:lastRenderedPageBreak/>
+        <w:drawing>
+          <wp:inline distT="0" distB="0" distL="0" distR="0" wp14:anchorId="416DB84E" wp14:editId="5218648E">
+            <wp:extent cx="5943600" cy="3060065"/>
+            <wp:effectExtent l="0" t="0" r="0" b="6985"/>
+            <wp:docPr id="1183394267" name="Picture 1"/>
+            <wp:cNvGraphicFramePr>
+              <a:graphicFrameLocks xmlns:a="http://schemas.openxmlformats.org/drawingml/2006/main" noChangeAspect="1"/>
+            </wp:cNvGraphicFramePr>
+            <a:graphic xmlns:a="http://schemas.openxmlformats.org/drawingml/2006/main">
+              <a:graphicData uri="http://schemas.openxmlformats.org/drawingml/2006/picture">
+                <pic:pic xmlns:pic="http://schemas.openxmlformats.org/drawingml/2006/picture">
+                  <pic:nvPicPr>
+                    <pic:cNvPr id="1183394267" name=""/>
+                    <pic:cNvPicPr/>
+                  </pic:nvPicPr>
+                  <pic:blipFill>
+                    <a:blip r:embed="rId12"/>
+                    <a:stretch>
+                      <a:fillRect/>
+                    </a:stretch>
+                  </pic:blipFill>
+                  <pic:spPr>
+                    <a:xfrm>
+                      <a:off x="0" y="0"/>
+                      <a:ext cx="5943600" cy="3060065"/>
+                    </a:xfrm>
+                    <a:prstGeom prst="rect">
+                      <a:avLst/>
+                    </a:prstGeom>
+                  </pic:spPr>
+                </pic:pic>
+              </a:graphicData>
+            </a:graphic>
+          </wp:inline>
+        </w:drawing>
+      </w:r>
+    </w:p>
+    <w:p/>
+    <w:p/>
+    <w:p>
+      <w:r>
         <w:rPr>
           <w:noProof/>
         </w:rPr>
-        <w:lastRenderedPageBreak/>
         <w:drawing>
           <wp:inline distT="0" distB="0" distL="0" distR="0" wp14:anchorId="60764887" wp14:editId="42C114BE">
             <wp:extent cx="5943600" cy="3068955"/>
@@ -1205,7 +1243,7 @@
                     </pic:cNvPicPr>
                   </pic:nvPicPr>
                   <pic:blipFill>
-                    <a:blip r:embed="rId12" cstate="print">
+                    <a:blip r:embed="rId13" cstate="print">
                       <a:extLst>
                         <a:ext uri="{28A0092B-C50C-407E-A947-70E740481C1C}">
                           <a14:useLocalDpi xmlns:a14="http://schemas.microsoft.com/office/drawing/2010/main" val="0"/>
@@ -1849,27 +1887,9 @@
   </w:abstractNum>
   <w:num w:numId="1" w16cid:durableId="85007407">
     <w:abstractNumId w:val="2"/>
-    <w:lvlOverride w:ilvl="0"/>
-    <w:lvlOverride w:ilvl="1"/>
-    <w:lvlOverride w:ilvl="2"/>
-    <w:lvlOverride w:ilvl="3"/>
-    <w:lvlOverride w:ilvl="4"/>
-    <w:lvlOverride w:ilvl="5"/>
-    <w:lvlOverride w:ilvl="6"/>
-    <w:lvlOverride w:ilvl="7"/>
-    <w:lvlOverride w:ilvl="8"/>
   </w:num>
   <w:num w:numId="2" w16cid:durableId="103772584">
     <w:abstractNumId w:val="3"/>
-    <w:lvlOverride w:ilvl="0"/>
-    <w:lvlOverride w:ilvl="1"/>
-    <w:lvlOverride w:ilvl="2"/>
-    <w:lvlOverride w:ilvl="3"/>
-    <w:lvlOverride w:ilvl="4"/>
-    <w:lvlOverride w:ilvl="5"/>
-    <w:lvlOverride w:ilvl="6"/>
-    <w:lvlOverride w:ilvl="7"/>
-    <w:lvlOverride w:ilvl="8"/>
   </w:num>
   <w:num w:numId="3" w16cid:durableId="484011243">
     <w:abstractNumId w:val="0"/>
@@ -2483,6 +2503,7 @@
   <w:style w:type="character" w:default="1" w:styleId="DefaultParagraphFont">
     <w:name w:val="Default Paragraph Font"/>
     <w:uiPriority w:val="1"/>
+    <w:semiHidden/>
     <w:unhideWhenUsed/>
   </w:style>
   <w:style w:type="table" w:default="1" w:styleId="TableNormal">

</xml_diff>